<commit_message>
april 1 finishing/double checking analyses chapter 1
</commit_message>
<xml_diff>
--- a/Oct_Workflow_Doc.docx
+++ b/Oct_Workflow_Doc.docx
@@ -3638,6 +3638,9 @@
       <w:r>
         <w:rPr>
           <w:rStyle w:val="CommentReference"/>
+          <w:rFonts w:ascii="Optima" w:hAnsi="Optima"/>
+          <w:sz w:val="24"/>
+          <w:szCs w:val="24"/>
         </w:rPr>
         <w:commentReference w:id="0"/>
       </w:r>
@@ -4412,6 +4415,11 @@
       <w:r>
         <w:rPr>
           <w:rStyle w:val="CommentReference"/>
+          <w:rFonts w:ascii="Optima" w:eastAsia="Times New Roman" w:hAnsi="Optima" w:cs="Times New Roman"/>
+          <w:kern w:val="0"/>
+          <w:sz w:val="24"/>
+          <w:szCs w:val="24"/>
+          <w14:ligatures w14:val="none"/>
         </w:rPr>
         <w:commentReference w:id="1"/>
       </w:r>
@@ -4419,6 +4427,11 @@
       <w:r>
         <w:rPr>
           <w:rStyle w:val="CommentReference"/>
+          <w:rFonts w:ascii="Optima" w:eastAsia="Times New Roman" w:hAnsi="Optima" w:cs="Times New Roman"/>
+          <w:kern w:val="0"/>
+          <w:sz w:val="24"/>
+          <w:szCs w:val="24"/>
+          <w14:ligatures w14:val="none"/>
         </w:rPr>
         <w:commentReference w:id="2"/>
       </w:r>
@@ -4426,6 +4439,11 @@
       <w:r>
         <w:rPr>
           <w:rStyle w:val="CommentReference"/>
+          <w:rFonts w:ascii="Optima" w:eastAsia="Times New Roman" w:hAnsi="Optima" w:cs="Times New Roman"/>
+          <w:kern w:val="0"/>
+          <w:sz w:val="24"/>
+          <w:szCs w:val="24"/>
+          <w14:ligatures w14:val="none"/>
         </w:rPr>
         <w:commentReference w:id="3"/>
       </w:r>
@@ -4433,6 +4451,11 @@
       <w:r>
         <w:rPr>
           <w:rStyle w:val="CommentReference"/>
+          <w:rFonts w:ascii="Optima" w:eastAsia="Times New Roman" w:hAnsi="Optima" w:cs="Times New Roman"/>
+          <w:kern w:val="0"/>
+          <w:sz w:val="24"/>
+          <w:szCs w:val="24"/>
+          <w14:ligatures w14:val="none"/>
         </w:rPr>
         <w:commentReference w:id="4"/>
       </w:r>
@@ -4672,17 +4695,7 @@
           <w:kern w:val="0"/>
           <w14:ligatures w14:val="none"/>
         </w:rPr>
-        <w:t>i</w:t>
-      </w:r>
-      <w:r>
-        <w:rPr>
-          <w:rFonts w:ascii="Optima" w:eastAsia="Times New Roman" w:hAnsi="Optima" w:cs="Times New Roman"/>
-          <w:i/>
-          <w:iCs/>
-          <w:kern w:val="0"/>
-          <w14:ligatures w14:val="none"/>
-        </w:rPr>
-        <w:t>f the sampling biases are orthogonal to your key relationships (e.g., random noise), unweighted OLS/logit estimates are unbiased. But if biases correlate with your predictors (and they often do), unweighted results can distort both main effects and interaction terms.</w:t>
+        <w:t>if the sampling biases are orthogonal to your key relationships (e.g., random noise), unweighted OLS/logit estimates are unbiased. But if biases correlate with your predictors (and they often do), unweighted results can distort both main effects and interaction terms.</w:t>
       </w:r>
     </w:p>
     <w:p>
@@ -5515,12 +5528,15 @@
       </w:pPr>
       <w:r>
         <w:rPr>
-          <w:rFonts w:ascii="Optima" w:eastAsia="Times New Roman" w:hAnsi="Optima" w:cs="Times New Roman"/>
           <w:noProof/>
-          <w:kern w:val="0"/>
-        </w:rPr>
-        <w:pict w14:anchorId="5BDA32A6">
-          <v:rect id="_x0000_i1032" alt="" style="width:468pt;height:.05pt;mso-width-percent:0;mso-height-percent:0;mso-width-percent:0;mso-height-percent:0" o:hralign="center" o:hrstd="t" o:hr="t" fillcolor="#a0a0a0" stroked="f"/>
+        </w:rPr>
+      </w:r>
+      <w:r>
+        <w:pict w14:anchorId="2ACFB691">
+          <v:rect id="Horizontal Line 1" o:spid="_x0000_s1033" style="width:468pt;height:.05pt;visibility:visible;mso-wrap-style:square;mso-left-percent:-10001;mso-top-percent:-10001;mso-position-horizontal:absolute;mso-position-horizontal-relative:char;mso-position-vertical:absolute;mso-position-vertical-relative:line;mso-left-percent:-10001;mso-top-percent:-10001;v-text-anchor:top" o:gfxdata="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" filled="f">
+            <o:lock v:ext="edit" rotation="t" aspectratio="t" verticies="t" text="t" shapetype="t"/>
+            <w10:anchorlock/>
+          </v:rect>
         </w:pict>
       </w:r>
     </w:p>
@@ -6625,12 +6641,15 @@
       </w:pPr>
       <w:r>
         <w:rPr>
-          <w:rFonts w:ascii="Optima" w:eastAsia="Times New Roman" w:hAnsi="Optima" w:cs="Times New Roman"/>
           <w:noProof/>
-          <w:kern w:val="0"/>
-        </w:rPr>
-        <w:pict w14:anchorId="5B553694">
-          <v:rect id="_x0000_i1031" alt="" style="width:468pt;height:.05pt;mso-width-percent:0;mso-height-percent:0;mso-width-percent:0;mso-height-percent:0" o:hralign="center" o:hrstd="t" o:hr="t" fillcolor="#a0a0a0" stroked="f"/>
+        </w:rPr>
+      </w:r>
+      <w:r>
+        <w:pict w14:anchorId="4EE6B953">
+          <v:rect id="Horizontal Line 2" o:spid="_x0000_s1032" style="width:468pt;height:.05pt;visibility:visible;mso-wrap-style:square;mso-left-percent:-10001;mso-top-percent:-10001;mso-position-horizontal:absolute;mso-position-horizontal-relative:char;mso-position-vertical:absolute;mso-position-vertical-relative:line;mso-left-percent:-10001;mso-top-percent:-10001;v-text-anchor:top" o:gfxdata="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" filled="f">
+            <o:lock v:ext="edit" rotation="t" aspectratio="t" verticies="t" text="t" shapetype="t"/>
+            <w10:anchorlock/>
+          </v:rect>
         </w:pict>
       </w:r>
     </w:p>
@@ -8741,12 +8760,15 @@
       </w:pPr>
       <w:r>
         <w:rPr>
-          <w:rFonts w:ascii="Optima" w:eastAsia="Times New Roman" w:hAnsi="Optima" w:cs="Times New Roman"/>
           <w:noProof/>
-          <w:kern w:val="0"/>
-        </w:rPr>
-        <w:pict w14:anchorId="6281FC2A">
-          <v:rect id="_x0000_i1030" alt="" style="width:468pt;height:.05pt;mso-width-percent:0;mso-height-percent:0;mso-width-percent:0;mso-height-percent:0" o:hralign="center" o:hrstd="t" o:hr="t" fillcolor="#a0a0a0" stroked="f"/>
+        </w:rPr>
+      </w:r>
+      <w:r>
+        <w:pict w14:anchorId="52523ED0">
+          <v:rect id="Horizontal Line 3" o:spid="_x0000_s1031" style="width:468pt;height:.05pt;visibility:visible;mso-wrap-style:square;mso-left-percent:-10001;mso-top-percent:-10001;mso-position-horizontal:absolute;mso-position-horizontal-relative:char;mso-position-vertical:absolute;mso-position-vertical-relative:line;mso-left-percent:-10001;mso-top-percent:-10001;v-text-anchor:top" o:gfxdata="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" filled="f">
+            <o:lock v:ext="edit" rotation="t" aspectratio="t" verticies="t" text="t" shapetype="t"/>
+            <w10:anchorlock/>
+          </v:rect>
         </w:pict>
       </w:r>
     </w:p>
@@ -9031,12 +9053,15 @@
       </w:pPr>
       <w:r>
         <w:rPr>
-          <w:rFonts w:ascii="Optima" w:eastAsia="Times New Roman" w:hAnsi="Optima" w:cs="Times New Roman"/>
           <w:noProof/>
-          <w:kern w:val="0"/>
-        </w:rPr>
-        <w:pict w14:anchorId="21E8DE2E">
-          <v:rect id="_x0000_i1029" alt="" style="width:468pt;height:.05pt;mso-width-percent:0;mso-height-percent:0;mso-width-percent:0;mso-height-percent:0" o:hralign="center" o:hrstd="t" o:hr="t" fillcolor="#a0a0a0" stroked="f"/>
+        </w:rPr>
+      </w:r>
+      <w:r>
+        <w:pict w14:anchorId="4143A914">
+          <v:rect id="Horizontal Line 4" o:spid="_x0000_s1030" style="width:468pt;height:.05pt;visibility:visible;mso-wrap-style:square;mso-left-percent:-10001;mso-top-percent:-10001;mso-position-horizontal:absolute;mso-position-horizontal-relative:char;mso-position-vertical:absolute;mso-position-vertical-relative:line;mso-left-percent:-10001;mso-top-percent:-10001;v-text-anchor:top" o:gfxdata="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" filled="f">
+            <o:lock v:ext="edit" rotation="t" aspectratio="t" verticies="t" text="t" shapetype="t"/>
+            <w10:anchorlock/>
+          </v:rect>
         </w:pict>
       </w:r>
     </w:p>
@@ -9806,12 +9831,15 @@
       </w:pPr>
       <w:r>
         <w:rPr>
-          <w:rFonts w:ascii="Optima" w:eastAsia="Times New Roman" w:hAnsi="Optima" w:cs="Times New Roman"/>
           <w:noProof/>
-          <w:kern w:val="0"/>
-        </w:rPr>
-        <w:pict w14:anchorId="507507EC">
-          <v:rect id="_x0000_i1028" alt="" style="width:468pt;height:.05pt;mso-width-percent:0;mso-height-percent:0;mso-width-percent:0;mso-height-percent:0" o:hralign="center" o:hrstd="t" o:hr="t" fillcolor="#a0a0a0" stroked="f"/>
+        </w:rPr>
+      </w:r>
+      <w:r>
+        <w:pict w14:anchorId="1AC8F33F">
+          <v:rect id="Horizontal Line 5" o:spid="_x0000_s1029" style="width:468pt;height:.05pt;visibility:visible;mso-wrap-style:square;mso-left-percent:-10001;mso-top-percent:-10001;mso-position-horizontal:absolute;mso-position-horizontal-relative:char;mso-position-vertical:absolute;mso-position-vertical-relative:line;mso-left-percent:-10001;mso-top-percent:-10001;v-text-anchor:top" o:gfxdata="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" filled="f">
+            <o:lock v:ext="edit" rotation="t" aspectratio="t" verticies="t" text="t" shapetype="t"/>
+            <w10:anchorlock/>
+          </v:rect>
         </w:pict>
       </w:r>
     </w:p>
@@ -11026,12 +11054,15 @@
       </w:pPr>
       <w:r>
         <w:rPr>
-          <w:rFonts w:ascii="Optima" w:eastAsia="Times New Roman" w:hAnsi="Optima" w:cs="Times New Roman"/>
           <w:noProof/>
-          <w:kern w:val="0"/>
-        </w:rPr>
-        <w:pict w14:anchorId="19DC03C7">
-          <v:rect id="_x0000_i1027" alt="" style="width:468pt;height:.05pt;mso-width-percent:0;mso-height-percent:0;mso-width-percent:0;mso-height-percent:0" o:hralign="center" o:hrstd="t" o:hr="t" fillcolor="#a0a0a0" stroked="f"/>
+        </w:rPr>
+      </w:r>
+      <w:r>
+        <w:pict w14:anchorId="503B1F14">
+          <v:rect id="Horizontal Line 6" o:spid="_x0000_s1028" style="width:468pt;height:.05pt;visibility:visible;mso-wrap-style:square;mso-left-percent:-10001;mso-top-percent:-10001;mso-position-horizontal:absolute;mso-position-horizontal-relative:char;mso-position-vertical:absolute;mso-position-vertical-relative:line;mso-left-percent:-10001;mso-top-percent:-10001;v-text-anchor:top" o:gfxdata="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" filled="f">
+            <o:lock v:ext="edit" rotation="t" aspectratio="t" verticies="t" text="t" shapetype="t"/>
+            <w10:anchorlock/>
+          </v:rect>
         </w:pict>
       </w:r>
     </w:p>
@@ -11326,12 +11357,15 @@
       </w:pPr>
       <w:r>
         <w:rPr>
-          <w:rFonts w:ascii="Optima" w:eastAsia="Times New Roman" w:hAnsi="Optima" w:cs="Times New Roman"/>
           <w:noProof/>
-          <w:kern w:val="0"/>
-        </w:rPr>
-        <w:pict w14:anchorId="0F8263EC">
-          <v:rect id="_x0000_i1026" alt="" style="width:468pt;height:.05pt;mso-width-percent:0;mso-height-percent:0;mso-width-percent:0;mso-height-percent:0" o:hralign="center" o:hrstd="t" o:hr="t" fillcolor="#a0a0a0" stroked="f"/>
+        </w:rPr>
+      </w:r>
+      <w:r>
+        <w:pict w14:anchorId="26BE9885">
+          <v:rect id="Horizontal Line 7" o:spid="_x0000_s1027" style="width:468pt;height:.05pt;visibility:visible;mso-wrap-style:square;mso-left-percent:-10001;mso-top-percent:-10001;mso-position-horizontal:absolute;mso-position-horizontal-relative:char;mso-position-vertical:absolute;mso-position-vertical-relative:line;mso-left-percent:-10001;mso-top-percent:-10001;v-text-anchor:top" o:gfxdata="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" filled="f">
+            <o:lock v:ext="edit" rotation="t" aspectratio="t" verticies="t" text="t" shapetype="t"/>
+            <w10:anchorlock/>
+          </v:rect>
         </w:pict>
       </w:r>
     </w:p>
@@ -11683,12 +11717,15 @@
       </w:pPr>
       <w:r>
         <w:rPr>
-          <w:rFonts w:ascii="Optima" w:eastAsia="Times New Roman" w:hAnsi="Optima" w:cs="Times New Roman"/>
           <w:noProof/>
-          <w:kern w:val="0"/>
-        </w:rPr>
-        <w:pict w14:anchorId="62ADB42F">
-          <v:rect id="_x0000_i1025" alt="" style="width:468pt;height:.05pt;mso-width-percent:0;mso-height-percent:0;mso-width-percent:0;mso-height-percent:0" o:hralign="center" o:hrstd="t" o:hr="t" fillcolor="#a0a0a0" stroked="f"/>
+        </w:rPr>
+      </w:r>
+      <w:r>
+        <w:pict w14:anchorId="78A331FC">
+          <v:rect id="Horizontal Line 8" o:spid="_x0000_s1026" style="width:468pt;height:.05pt;visibility:visible;mso-wrap-style:square;mso-left-percent:-10001;mso-top-percent:-10001;mso-position-horizontal:absolute;mso-position-horizontal-relative:char;mso-position-vertical:absolute;mso-position-vertical-relative:line;mso-left-percent:-10001;mso-top-percent:-10001;v-text-anchor:top" o:gfxdata="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" filled="f">
+            <o:lock v:ext="edit" rotation="t" aspectratio="t" verticies="t" text="t" shapetype="t"/>
+            <w10:anchorlock/>
+          </v:rect>
         </w:pict>
       </w:r>
     </w:p>
@@ -16123,6 +16160,7 @@
   <w:style w:type="character" w:default="1" w:styleId="DefaultParagraphFont">
     <w:name w:val="Default Paragraph Font"/>
     <w:uiPriority w:val="1"/>
+    <w:semiHidden/>
     <w:unhideWhenUsed/>
   </w:style>
   <w:style w:type="table" w:default="1" w:styleId="TableNormal">

</xml_diff>